<commit_message>
Amend manuscript for Springer submission: remove declarations/ethics/funding from main text, clarify Table 4 location, update cover letter with author details
Changes:
- Removed Ethical statement section (3.10) from manuscript.md/.tex and DOCX
- Removed Declarations section (availability, competing interests, funding, authors' contributions, acknowledgements, AI disclosure, ethics approval, consent to publish) from main manuscript
- Added [Table 4 about here] note to indicate table placement
- Updated cover_letter.docx with author details (Aldrin Manon, ICFAI Tech School)
- Updated title_page.md author contributions section
</commit_message>
<xml_diff>
--- a/project/manuscript/cover_letter.docx
+++ b/project/manuscript/cover_letter.docx
@@ -12,13 +12,11 @@
       </w:r>
     </w:p>
     <w:p>
-      <w:pPr>
-        <w:spacing w:after="240"/>
-      </w:pPr>
       <w:r>
         <w:t>To the Editors,</w:t>
-        <w:br/>
       </w:r>
+    </w:p>
+    <w:p>
       <w:r>
         <w:t>Disciplinary and Interdisciplinary Science Education Research</w:t>
       </w:r>
@@ -52,13 +50,7 @@
     <w:p/>
     <w:p>
       <w:r>
-        <w:t>This study addresses the gap between disciplinary and interdisciplinary science education by computationally mapping knowledge exchange across 15 major journals using citation-network analysis and topic modeling.</w:t>
-      </w:r>
-    </w:p>
-    <w:p/>
-    <w:p>
-      <w:r>
-        <w:t>We combine bibliometric mapping, brokerage metrics (cross-tag share, E-I index, Rao-Stirling diversity, betweenness centrality), and topic modeling to characterize disciplinary silos and interdisciplinary bridges. Our key finding is that DISER functions as the primary disciplinary bridge (cross-tag share 0.841, E-I index +0.68), while JCE remains the most siloed journal (cross-tag share 0.048). We show that brokerage conclusions are robust across sensitivity analyses (alternative weighting schemes, direction decomposition, leave-one-journal-out).</w:t>
+        <w:t>This study addresses the gap between disciplinary and interdisciplinary science education by computationally mapping knowledge exchange across 15 major journals using citation-network analysis and topic modeling. We combine bibliometric mapping, brokerage metrics (cross-tag share, E-I index, Rao-Stokes diversity, betweenness centrality), and topic modeling to characterize disciplinary silos and interdisciplinary bridges. Our key finding is that DISER functions as the primary disciplinary bridge (cross-tag share 0.841, E-I index +0.68), while JCE remains the most siloed journal (cross-tag share 0.048). We show that brokerage conclusions are robust across sensitivity analyses (alternative weighting schemes, direction decomposition, leave-one-journal-out).</w:t>
       </w:r>
     </w:p>
     <w:p/>

</xml_diff>